<commit_message>
fix open Temporal UI
</commit_message>
<xml_diff>
--- a/Temporal-IO_pt.docx
+++ b/Temporal-IO_pt.docx
@@ -2263,14 +2263,12 @@
         </w:rPr>
         <w:t xml:space="preserve">sinal periódico que a </w:t>
       </w:r>
-      <w:proofErr w:type="spellStart"/>
-      <w:r>
-        <w:rPr>
-          <w:rFonts w:cs="Times New Roman"/>
-        </w:rPr>
-        <w:t>activity</w:t>
-      </w:r>
-      <w:proofErr w:type="spellEnd"/>
+      <w:r>
+        <w:rPr>
+          <w:rFonts w:cs="Times New Roman"/>
+        </w:rPr>
+        <w:t>Activity</w:t>
+      </w:r>
       <w:r>
         <w:rPr>
           <w:rFonts w:cs="Times New Roman"/>
@@ -8497,30 +8495,17 @@
         </w:rPr>
         <w:t xml:space="preserve">Temporal Workflow – </w:t>
       </w:r>
-      <w:r>
-        <w:fldChar w:fldCharType="begin"/>
-      </w:r>
-      <w:r>
-        <w:rPr>
-          <w:lang w:val="en-US"/>
-        </w:rPr>
-        <w:instrText>HYPERLINK "https://docs.temporal.io/workflows"</w:instrText>
-      </w:r>
-      <w:r>
-        <w:fldChar w:fldCharType="separate"/>
-      </w:r>
-      <w:r>
-        <w:rPr>
-          <w:rStyle w:val="Hiperligao"/>
-          <w:rFonts w:cs="Times New Roman"/>
-          <w:color w:val="0070C0"/>
-          <w:lang w:val="en-US"/>
-        </w:rPr>
-        <w:t>https://docs.temporal.io/workflows</w:t>
-      </w:r>
-      <w:r>
-        <w:fldChar w:fldCharType="end"/>
-      </w:r>
+      <w:hyperlink r:id="rId15" w:history="1">
+        <w:r>
+          <w:rPr>
+            <w:rStyle w:val="Hiperligao"/>
+            <w:rFonts w:cs="Times New Roman"/>
+            <w:color w:val="0070C0"/>
+            <w:lang w:val="en-US"/>
+          </w:rPr>
+          <w:t>https://docs.temporal.io/workflows</w:t>
+        </w:r>
+      </w:hyperlink>
       <w:r>
         <w:rPr>
           <w:rFonts w:cs="Times New Roman"/>
@@ -8557,7 +8542,7 @@
         </w:rPr>
         <w:t xml:space="preserve">emporal activity – </w:t>
       </w:r>
-      <w:hyperlink r:id="rId15" w:history="1">
+      <w:hyperlink r:id="rId16" w:history="1">
         <w:r>
           <w:rPr>
             <w:rStyle w:val="Hiperligao"/>
@@ -8597,30 +8582,17 @@
         </w:rPr>
         <w:t xml:space="preserve">Temporal worker – </w:t>
       </w:r>
-      <w:r>
-        <w:fldChar w:fldCharType="begin"/>
-      </w:r>
-      <w:r>
-        <w:rPr>
-          <w:lang w:val="en-US"/>
-        </w:rPr>
-        <w:instrText>HYPERLINK "https://docs.temporal.io/workers"</w:instrText>
-      </w:r>
-      <w:r>
-        <w:fldChar w:fldCharType="separate"/>
-      </w:r>
-      <w:r>
-        <w:rPr>
-          <w:rStyle w:val="Hiperligao"/>
-          <w:rFonts w:cs="Times New Roman"/>
-          <w:color w:val="0070C0"/>
-          <w:lang w:val="en-US"/>
-        </w:rPr>
-        <w:t>https://docs.temporal.io/workers</w:t>
-      </w:r>
-      <w:r>
-        <w:fldChar w:fldCharType="end"/>
-      </w:r>
+      <w:hyperlink r:id="rId17" w:history="1">
+        <w:r>
+          <w:rPr>
+            <w:rStyle w:val="Hiperligao"/>
+            <w:rFonts w:cs="Times New Roman"/>
+            <w:color w:val="0070C0"/>
+            <w:lang w:val="en-US"/>
+          </w:rPr>
+          <w:t>https://docs.temporal.io/workers</w:t>
+        </w:r>
+      </w:hyperlink>
       <w:r>
         <w:rPr>
           <w:rFonts w:cs="Times New Roman"/>
@@ -8650,30 +8622,17 @@
         </w:rPr>
         <w:t xml:space="preserve">Retry Policies – </w:t>
       </w:r>
-      <w:r>
-        <w:fldChar w:fldCharType="begin"/>
-      </w:r>
-      <w:r>
-        <w:rPr>
-          <w:lang w:val="en-US"/>
-        </w:rPr>
-        <w:instrText>HYPERLINK "https://docs.temporal.io/encyclopedia/retry-policies"</w:instrText>
-      </w:r>
-      <w:r>
-        <w:fldChar w:fldCharType="separate"/>
-      </w:r>
-      <w:r>
-        <w:rPr>
-          <w:rStyle w:val="Hiperligao"/>
-          <w:rFonts w:cs="Times New Roman"/>
-          <w:color w:val="0070C0"/>
-          <w:lang w:val="en-US"/>
-        </w:rPr>
-        <w:t>https://docs.temporal.io/encyclopedia/retry-policies</w:t>
-      </w:r>
-      <w:r>
-        <w:fldChar w:fldCharType="end"/>
-      </w:r>
+      <w:hyperlink r:id="rId18" w:history="1">
+        <w:r>
+          <w:rPr>
+            <w:rStyle w:val="Hiperligao"/>
+            <w:rFonts w:cs="Times New Roman"/>
+            <w:color w:val="0070C0"/>
+            <w:lang w:val="en-US"/>
+          </w:rPr>
+          <w:t>https://docs.temporal.io/encyclopedia/retry-policies</w:t>
+        </w:r>
+      </w:hyperlink>
       <w:r>
         <w:rPr>
           <w:rFonts w:cs="Times New Roman"/>
@@ -8711,7 +8670,7 @@
         </w:rPr>
         <w:t xml:space="preserve"> </w:t>
       </w:r>
-      <w:hyperlink r:id="rId16" w:history="1">
+      <w:hyperlink r:id="rId19" w:history="1">
         <w:r>
           <w:rPr>
             <w:rStyle w:val="Hiperligao"/>
@@ -8750,30 +8709,17 @@
         </w:rPr>
         <w:t xml:space="preserve">Event History – </w:t>
       </w:r>
-      <w:r>
-        <w:fldChar w:fldCharType="begin"/>
-      </w:r>
-      <w:r>
-        <w:rPr>
-          <w:lang w:val="en-US"/>
-        </w:rPr>
-        <w:instrText>HYPERLINK "https://docs.temporal.io/encyclopedia/event-history/"</w:instrText>
-      </w:r>
-      <w:r>
-        <w:fldChar w:fldCharType="separate"/>
-      </w:r>
-      <w:r>
-        <w:rPr>
-          <w:rStyle w:val="Hiperligao"/>
-          <w:rFonts w:cs="Times New Roman"/>
-          <w:color w:val="0070C0"/>
-          <w:lang w:val="en-US"/>
-        </w:rPr>
-        <w:t>https://docs.temporal.io/encyclopedia/event-history/</w:t>
-      </w:r>
-      <w:r>
-        <w:fldChar w:fldCharType="end"/>
-      </w:r>
+      <w:hyperlink r:id="rId20" w:history="1">
+        <w:r>
+          <w:rPr>
+            <w:rStyle w:val="Hiperligao"/>
+            <w:rFonts w:cs="Times New Roman"/>
+            <w:color w:val="0070C0"/>
+            <w:lang w:val="en-US"/>
+          </w:rPr>
+          <w:t>https://docs.temporal.io/encyclopedia/event-history/</w:t>
+        </w:r>
+      </w:hyperlink>
       <w:r>
         <w:rPr>
           <w:rFonts w:cs="Times New Roman"/>
@@ -8801,7 +8747,7 @@
         </w:rPr>
         <w:t xml:space="preserve">Percebendo o Temporal – </w:t>
       </w:r>
-      <w:hyperlink r:id="rId17" w:history="1">
+      <w:hyperlink r:id="rId21" w:history="1">
         <w:r>
           <w:rPr>
             <w:rStyle w:val="Hiperligao"/>
@@ -8863,7 +8809,7 @@
         </w:rPr>
         <w:t xml:space="preserve"> – </w:t>
       </w:r>
-      <w:hyperlink r:id="rId18" w:history="1">
+      <w:hyperlink r:id="rId22" w:history="1">
         <w:r>
           <w:rPr>
             <w:rStyle w:val="Hiperligao"/>
@@ -8901,30 +8847,17 @@
         </w:rPr>
         <w:t xml:space="preserve">Workflows with Temporal – </w:t>
       </w:r>
-      <w:r>
-        <w:fldChar w:fldCharType="begin"/>
-      </w:r>
-      <w:r>
-        <w:rPr>
-          <w:lang w:val="en-US"/>
-        </w:rPr>
-        <w:instrText>HYPERLINK "https://www.youtube.com/watch?v=LulonIoYOP8"</w:instrText>
-      </w:r>
-      <w:r>
-        <w:fldChar w:fldCharType="separate"/>
-      </w:r>
-      <w:r>
-        <w:rPr>
-          <w:rStyle w:val="Hiperligao"/>
-          <w:rFonts w:cs="Times New Roman"/>
-          <w:color w:val="0070C0"/>
-          <w:lang w:val="en-US"/>
-        </w:rPr>
-        <w:t>https://www.youtube.com/watch?v=LulonIoYOP8</w:t>
-      </w:r>
-      <w:r>
-        <w:fldChar w:fldCharType="end"/>
-      </w:r>
+      <w:hyperlink r:id="rId23" w:history="1">
+        <w:r>
+          <w:rPr>
+            <w:rStyle w:val="Hiperligao"/>
+            <w:rFonts w:cs="Times New Roman"/>
+            <w:color w:val="0070C0"/>
+            <w:lang w:val="en-US"/>
+          </w:rPr>
+          <w:t>https://www.youtube.com/watch?v=LulonIoYOP8</w:t>
+        </w:r>
+      </w:hyperlink>
       <w:r>
         <w:rPr>
           <w:rFonts w:cs="Times New Roman"/>
@@ -8962,7 +8895,7 @@
         </w:rPr>
         <w:t xml:space="preserve"> – </w:t>
       </w:r>
-      <w:hyperlink r:id="rId19" w:history="1">
+      <w:hyperlink r:id="rId24" w:history="1">
         <w:r>
           <w:rPr>
             <w:rStyle w:val="Hiperligao"/>
@@ -8983,9 +8916,9 @@
       </w:r>
     </w:p>
     <w:sectPr>
-      <w:footerReference w:type="even" r:id="rId20"/>
-      <w:footerReference w:type="default" r:id="rId21"/>
-      <w:headerReference w:type="first" r:id="rId22"/>
+      <w:footerReference w:type="even" r:id="rId25"/>
+      <w:footerReference w:type="default" r:id="rId26"/>
+      <w:headerReference w:type="first" r:id="rId27"/>
       <w:pgSz w:w="11906" w:h="16838"/>
       <w:pgMar w:top="1417" w:right="1701" w:bottom="1417" w:left="1701" w:header="708" w:footer="708" w:gutter="0"/>
       <w:cols w:space="708"/>

</xml_diff>